<commit_message>
Guía de uso con capturas de pantalla de la barra de la base (roja sin conectar y verde conectada)
Co-Authored-By: Claude Fable 5 <noreply@anthropic.com>
Claude-Session: https://claude.ai/code/session_0166RiLn2rUwdXUeF7kGLw2U
</commit_message>
<xml_diff>
--- a/Guia-de-uso-Tracking-Iniciativas.docx
+++ b/Guia-de-uso-Tracking-Iniciativas.docx
@@ -360,6 +360,69 @@
     </w:p>
     <w:p>
       <w:pPr>
+        <w:spacing w:after="40" w:before="80"/>
+        <w:jc w:val="center"/>
+      </w:pPr>
+      <w:r>
+        <w:drawing>
+          <wp:inline distT="0" distB="0" distL="0" distR="0">
+            <wp:extent cx="5905500" cy="1047750"/>
+            <wp:effectExtent t="0" r="0" b="0" l="0"/>
+            <wp:docPr id="1" name="" descr="" title=""/>
+            <wp:cNvGraphicFramePr>
+              <a:graphicFrameLocks xmlns:a="http://schemas.openxmlformats.org/drawingml/2006/main" noChangeAspect="1"/>
+            </wp:cNvGraphicFramePr>
+            <a:graphic xmlns:a="http://schemas.openxmlformats.org/drawingml/2006/main">
+              <a:graphicData uri="http://schemas.openxmlformats.org/drawingml/2006/picture">
+                <pic:pic xmlns:pic="http://schemas.openxmlformats.org/drawingml/2006/picture">
+                  <pic:nvPicPr>
+                    <pic:cNvPr id="0" name="" descr=""/>
+                    <pic:cNvPicPr>
+                      <a:picLocks noChangeAspect="1" noChangeArrowheads="1"/>
+                    </pic:cNvPicPr>
+                  </pic:nvPicPr>
+                  <pic:blipFill>
+                    <a:blip r:embed="rId7" cstate="none"/>
+                    <a:srcRect/>
+                    <a:stretch>
+                      <a:fillRect/>
+                    </a:stretch>
+                  </pic:blipFill>
+                  <pic:spPr bwMode="auto">
+                    <a:xfrm>
+                      <a:off x="0" y="0"/>
+                      <a:ext cx="5905500" cy="1047750"/>
+                    </a:xfrm>
+                    <a:prstGeom prst="rect">
+                      <a:avLst/>
+                    </a:prstGeom>
+                  </pic:spPr>
+                </pic:pic>
+              </a:graphicData>
+            </a:graphic>
+          </wp:inline>
+        </w:drawing>
+      </w:r>
+    </w:p>
+    <w:p>
+      <w:pPr>
+        <w:spacing w:after="200"/>
+        <w:jc w:val="center"/>
+      </w:pPr>
+      <w:r>
+        <w:rPr>
+          <w:rFonts w:ascii="Calibri" w:cs="Calibri" w:eastAsia="Calibri" w:hAnsi="Calibri"/>
+          <w:i/>
+          <w:iCs/>
+          <w:color w:val="8A938F"/>
+          <w:sz w:val="18"/>
+          <w:szCs w:val="18"/>
+        </w:rPr>
+        <w:t xml:space="preserve">Así se ve la barra cuando todavía no hay base conectada (punto rojo).</w:t>
+      </w:r>
+    </w:p>
+    <w:p>
+      <w:pPr>
         <w:spacing w:after="140" w:line="300"/>
         <w:ind w:left="360" w:hanging="360"/>
       </w:pPr>
@@ -556,6 +619,69 @@
           <w:szCs w:val="22"/>
         </w:rPr>
         <w:t xml:space="preserve">. Recién ahí tus cambios se guardan para todo el equipo.</w:t>
+      </w:r>
+    </w:p>
+    <w:p>
+      <w:pPr>
+        <w:spacing w:after="40" w:before="80"/>
+        <w:jc w:val="center"/>
+      </w:pPr>
+      <w:r>
+        <w:drawing>
+          <wp:inline distT="0" distB="0" distL="0" distR="0">
+            <wp:extent cx="5905500" cy="1047750"/>
+            <wp:effectExtent t="0" r="0" b="0" l="0"/>
+            <wp:docPr id="1" name="" descr="" title=""/>
+            <wp:cNvGraphicFramePr>
+              <a:graphicFrameLocks xmlns:a="http://schemas.openxmlformats.org/drawingml/2006/main" noChangeAspect="1"/>
+            </wp:cNvGraphicFramePr>
+            <a:graphic xmlns:a="http://schemas.openxmlformats.org/drawingml/2006/main">
+              <a:graphicData uri="http://schemas.openxmlformats.org/drawingml/2006/picture">
+                <pic:pic xmlns:pic="http://schemas.openxmlformats.org/drawingml/2006/picture">
+                  <pic:nvPicPr>
+                    <pic:cNvPr id="0" name="" descr=""/>
+                    <pic:cNvPicPr>
+                      <a:picLocks noChangeAspect="1" noChangeArrowheads="1"/>
+                    </pic:cNvPicPr>
+                  </pic:nvPicPr>
+                  <pic:blipFill>
+                    <a:blip r:embed="rId8" cstate="none"/>
+                    <a:srcRect/>
+                    <a:stretch>
+                      <a:fillRect/>
+                    </a:stretch>
+                  </pic:blipFill>
+                  <pic:spPr bwMode="auto">
+                    <a:xfrm>
+                      <a:off x="0" y="0"/>
+                      <a:ext cx="5905500" cy="1047750"/>
+                    </a:xfrm>
+                    <a:prstGeom prst="rect">
+                      <a:avLst/>
+                    </a:prstGeom>
+                  </pic:spPr>
+                </pic:pic>
+              </a:graphicData>
+            </a:graphic>
+          </wp:inline>
+        </w:drawing>
+      </w:r>
+    </w:p>
+    <w:p>
+      <w:pPr>
+        <w:spacing w:after="200"/>
+        <w:jc w:val="center"/>
+      </w:pPr>
+      <w:r>
+        <w:rPr>
+          <w:rFonts w:ascii="Calibri" w:cs="Calibri" w:eastAsia="Calibri" w:hAnsi="Calibri"/>
+          <w:i/>
+          <w:iCs/>
+          <w:color w:val="8A938F"/>
+          <w:sz w:val="18"/>
+          <w:szCs w:val="18"/>
+        </w:rPr>
+        <w:t xml:space="preserve">Así queda la barra con la base conectada (punto verde): recién ahí se guardan los cambios.</w:t>
       </w:r>
     </w:p>
     <w:p>

</xml_diff>

<commit_message>
Guía de uso: captura de la barra amarilla de Reconectar base en la sección 4
Co-Authored-By: Claude Fable 5 <noreply@anthropic.com>
Claude-Session: https://claude.ai/code/session_0166RiLn2rUwdXUeF7kGLw2U
</commit_message>
<xml_diff>
--- a/Guia-de-uso-Tracking-Iniciativas.docx
+++ b/Guia-de-uso-Tracking-Iniciativas.docx
@@ -756,6 +756,69 @@
           <w:szCs w:val="22"/>
         </w:rPr>
         <w:t xml:space="preserve">: hacé clic y aceptá el permiso. Un segundo y ya estás conectado.</w:t>
+      </w:r>
+    </w:p>
+    <w:p>
+      <w:pPr>
+        <w:spacing w:after="40" w:before="80"/>
+        <w:jc w:val="center"/>
+      </w:pPr>
+      <w:r>
+        <w:drawing>
+          <wp:inline distT="0" distB="0" distL="0" distR="0">
+            <wp:extent cx="5905500" cy="1047750"/>
+            <wp:effectExtent t="0" r="0" b="0" l="0"/>
+            <wp:docPr id="1" name="" descr="" title=""/>
+            <wp:cNvGraphicFramePr>
+              <a:graphicFrameLocks xmlns:a="http://schemas.openxmlformats.org/drawingml/2006/main" noChangeAspect="1"/>
+            </wp:cNvGraphicFramePr>
+            <a:graphic xmlns:a="http://schemas.openxmlformats.org/drawingml/2006/main">
+              <a:graphicData uri="http://schemas.openxmlformats.org/drawingml/2006/picture">
+                <pic:pic xmlns:pic="http://schemas.openxmlformats.org/drawingml/2006/picture">
+                  <pic:nvPicPr>
+                    <pic:cNvPr id="0" name="" descr=""/>
+                    <pic:cNvPicPr>
+                      <a:picLocks noChangeAspect="1" noChangeArrowheads="1"/>
+                    </pic:cNvPicPr>
+                  </pic:nvPicPr>
+                  <pic:blipFill>
+                    <a:blip r:embed="rId9" cstate="none"/>
+                    <a:srcRect/>
+                    <a:stretch>
+                      <a:fillRect/>
+                    </a:stretch>
+                  </pic:blipFill>
+                  <pic:spPr bwMode="auto">
+                    <a:xfrm>
+                      <a:off x="0" y="0"/>
+                      <a:ext cx="5905500" cy="1047750"/>
+                    </a:xfrm>
+                    <a:prstGeom prst="rect">
+                      <a:avLst/>
+                    </a:prstGeom>
+                  </pic:spPr>
+                </pic:pic>
+              </a:graphicData>
+            </a:graphic>
+          </wp:inline>
+        </w:drawing>
+      </w:r>
+    </w:p>
+    <w:p>
+      <w:pPr>
+        <w:spacing w:after="200"/>
+        <w:jc w:val="center"/>
+      </w:pPr>
+      <w:r>
+        <w:rPr>
+          <w:rFonts w:ascii="Calibri" w:cs="Calibri" w:eastAsia="Calibri" w:hAnsi="Calibri"/>
+          <w:i/>
+          <w:iCs/>
+          <w:color w:val="8A938F"/>
+          <w:sz w:val="18"/>
+          <w:szCs w:val="18"/>
+        </w:rPr>
+        <w:t xml:space="preserve">La barra amarilla al reabrir la app: un clic en “Reconectar base” y listo.</w:t>
       </w:r>
     </w:p>
     <w:p>

</xml_diff>

<commit_message>
Aviso de versión desactualizada de la app y sección de acceso directo en la guía
- La app estampa su versión en la base al guardar; una copia vieja que lee una base guardada por una versión más nueva muestra un aviso para volver al HTML oficial de la carpeta compartida
- Guía de uso: nueva sección 7 con los pasos para que cada persona cree su acceso directo al único HTML compartido (y nota sobre la papelera de OneDrive ante borrados accidentales)

Co-Authored-By: Claude Fable 5 <noreply@anthropic.com>
Claude-Session: https://claude.ai/code/session_0166RiLn2rUwdXUeF7kGLw2U
</commit_message>
<xml_diff>
--- a/Guia-de-uso-Tracking-Iniciativas.docx
+++ b/Guia-de-uso-Tracking-Iniciativas.docx
@@ -1175,7 +1175,272 @@
           <w:sz w:val="30"/>
           <w:szCs w:val="30"/>
         </w:rPr>
-        <w:t xml:space="preserve">7. Si algo no se ve como esperabas</w:t>
+        <w:t xml:space="preserve">7. Entrá siempre por tu acceso directo (recomendado)</w:t>
+      </w:r>
+    </w:p>
+    <w:p>
+      <w:pPr>
+        <w:spacing w:after="160" w:line="300"/>
+      </w:pPr>
+      <w:r>
+        <w:rPr>
+          <w:rFonts w:ascii="Calibri" w:cs="Calibri" w:eastAsia="Calibri" w:hAnsi="Calibri"/>
+          <w:color w:val="2E3A36"/>
+          <w:sz w:val="22"/>
+          <w:szCs w:val="22"/>
+        </w:rPr>
+        <w:t xml:space="preserve">Para el día a día no hace falta navegar la carpeta compartida (y así evitamos borrar o mover un archivo sin querer). Cada persona se crea su propio acceso directo, una sola vez:</w:t>
+      </w:r>
+    </w:p>
+    <w:p>
+      <w:pPr>
+        <w:spacing w:after="140" w:line="300"/>
+        <w:ind w:left="360" w:hanging="360"/>
+      </w:pPr>
+      <w:r>
+        <w:rPr>
+          <w:rFonts w:ascii="Calibri" w:cs="Calibri" w:eastAsia="Calibri" w:hAnsi="Calibri"/>
+          <w:b/>
+          <w:bCs/>
+          <w:color w:val="1E7A45"/>
+          <w:sz w:val="22"/>
+          <w:szCs w:val="22"/>
+        </w:rPr>
+        <w:t xml:space="preserve">1.  </w:t>
+      </w:r>
+      <w:r>
+        <w:rPr>
+          <w:rFonts w:ascii="Calibri" w:cs="Calibri" w:eastAsia="Calibri" w:hAnsi="Calibri"/>
+          <w:b w:val="false"/>
+          <w:bCs w:val="false"/>
+          <w:color w:val="2E3A36"/>
+          <w:sz w:val="22"/>
+          <w:szCs w:val="22"/>
+        </w:rPr>
+        <w:t xml:space="preserve">Abrí la carpeta compartida en el Explorador de archivos (solo esta vez).</w:t>
+      </w:r>
+    </w:p>
+    <w:p>
+      <w:pPr>
+        <w:spacing w:after="140" w:line="300"/>
+        <w:ind w:left="360" w:hanging="360"/>
+      </w:pPr>
+      <w:r>
+        <w:rPr>
+          <w:rFonts w:ascii="Calibri" w:cs="Calibri" w:eastAsia="Calibri" w:hAnsi="Calibri"/>
+          <w:b/>
+          <w:bCs/>
+          <w:color w:val="1E7A45"/>
+          <w:sz w:val="22"/>
+          <w:szCs w:val="22"/>
+        </w:rPr>
+        <w:t xml:space="preserve">2.  </w:t>
+      </w:r>
+      <w:r>
+        <w:rPr>
+          <w:rFonts w:ascii="Calibri" w:cs="Calibri" w:eastAsia="Calibri" w:hAnsi="Calibri"/>
+          <w:b w:val="false"/>
+          <w:bCs w:val="false"/>
+          <w:color w:val="2E3A36"/>
+          <w:sz w:val="22"/>
+          <w:szCs w:val="22"/>
+        </w:rPr>
+        <w:t xml:space="preserve">Clic derecho sobre </w:t>
+      </w:r>
+      <w:r>
+        <w:rPr>
+          <w:rFonts w:ascii="Calibri" w:cs="Calibri" w:eastAsia="Calibri" w:hAnsi="Calibri"/>
+          <w:b/>
+          <w:bCs/>
+          <w:color w:val="2E3A36"/>
+          <w:sz w:val="22"/>
+          <w:szCs w:val="22"/>
+        </w:rPr>
+        <w:t xml:space="preserve">tracking-iniciativas-sin-servidor.html</w:t>
+      </w:r>
+      <w:r>
+        <w:rPr>
+          <w:rFonts w:ascii="Calibri" w:cs="Calibri" w:eastAsia="Calibri" w:hAnsi="Calibri"/>
+          <w:b w:val="false"/>
+          <w:bCs w:val="false"/>
+          <w:color w:val="2E3A36"/>
+          <w:sz w:val="22"/>
+          <w:szCs w:val="22"/>
+        </w:rPr>
+        <w:t xml:space="preserve"> → </w:t>
+      </w:r>
+      <w:r>
+        <w:rPr>
+          <w:rFonts w:ascii="Calibri" w:cs="Calibri" w:eastAsia="Calibri" w:hAnsi="Calibri"/>
+          <w:b/>
+          <w:bCs/>
+          <w:color w:val="2E3A36"/>
+          <w:sz w:val="22"/>
+          <w:szCs w:val="22"/>
+        </w:rPr>
+        <w:t xml:space="preserve">Enviar a → Escritorio (crear acceso directo)</w:t>
+      </w:r>
+      <w:r>
+        <w:rPr>
+          <w:rFonts w:ascii="Calibri" w:cs="Calibri" w:eastAsia="Calibri" w:hAnsi="Calibri"/>
+          <w:b w:val="false"/>
+          <w:bCs w:val="false"/>
+          <w:color w:val="2E3A36"/>
+          <w:sz w:val="22"/>
+          <w:szCs w:val="22"/>
+        </w:rPr>
+        <w:t xml:space="preserve">.</w:t>
+      </w:r>
+    </w:p>
+    <w:p>
+      <w:pPr>
+        <w:spacing w:after="140" w:line="300"/>
+        <w:ind w:left="360" w:hanging="360"/>
+      </w:pPr>
+      <w:r>
+        <w:rPr>
+          <w:rFonts w:ascii="Calibri" w:cs="Calibri" w:eastAsia="Calibri" w:hAnsi="Calibri"/>
+          <w:b/>
+          <w:bCs/>
+          <w:color w:val="1E7A45"/>
+          <w:sz w:val="22"/>
+          <w:szCs w:val="22"/>
+        </w:rPr>
+        <w:t xml:space="preserve">3.  </w:t>
+      </w:r>
+      <w:r>
+        <w:rPr>
+          <w:rFonts w:ascii="Calibri" w:cs="Calibri" w:eastAsia="Calibri" w:hAnsi="Calibri"/>
+          <w:b w:val="false"/>
+          <w:bCs w:val="false"/>
+          <w:color w:val="2E3A36"/>
+          <w:sz w:val="22"/>
+          <w:szCs w:val="22"/>
+        </w:rPr>
+        <w:t xml:space="preserve">En el Escritorio, renombralo como </w:t>
+      </w:r>
+      <w:r>
+        <w:rPr>
+          <w:rFonts w:ascii="Calibri" w:cs="Calibri" w:eastAsia="Calibri" w:hAnsi="Calibri"/>
+          <w:b/>
+          <w:bCs/>
+          <w:color w:val="2E3A36"/>
+          <w:sz w:val="22"/>
+          <w:szCs w:val="22"/>
+        </w:rPr>
+        <w:t xml:space="preserve">“Tracking de Iniciativas S&amp;OP”</w:t>
+      </w:r>
+      <w:r>
+        <w:rPr>
+          <w:rFonts w:ascii="Calibri" w:cs="Calibri" w:eastAsia="Calibri" w:hAnsi="Calibri"/>
+          <w:b w:val="false"/>
+          <w:bCs w:val="false"/>
+          <w:color w:val="2E3A36"/>
+          <w:sz w:val="22"/>
+          <w:szCs w:val="22"/>
+        </w:rPr>
+        <w:t xml:space="preserve">. A partir de ahora entrá siempre con doble clic ahí.</w:t>
+      </w:r>
+    </w:p>
+    <w:p>
+      <w:pPr>
+        <w:pStyle w:val="ListParagraph"/>
+        <w:numPr>
+          <w:ilvl w:val="0"/>
+          <w:numId w:val="2"/>
+        </w:numPr>
+        <w:spacing w:after="120" w:line="300"/>
+      </w:pPr>
+      <w:r>
+        <w:rPr>
+          <w:rFonts w:ascii="Calibri" w:cs="Calibri" w:eastAsia="Calibri" w:hAnsi="Calibri"/>
+          <w:b w:val="false"/>
+          <w:bCs w:val="false"/>
+          <w:color w:val="2E3A36"/>
+          <w:sz w:val="22"/>
+          <w:szCs w:val="22"/>
+        </w:rPr>
+        <w:t xml:space="preserve">El acceso directo apunta al único HTML de la carpeta compartida: cuando se publique una versión nueva de la app, la tomás automáticamente sin hacer nada.</w:t>
+      </w:r>
+    </w:p>
+    <w:p>
+      <w:pPr>
+        <w:pStyle w:val="ListParagraph"/>
+        <w:numPr>
+          <w:ilvl w:val="0"/>
+          <w:numId w:val="2"/>
+        </w:numPr>
+        <w:spacing w:after="120" w:line="300"/>
+      </w:pPr>
+      <w:r>
+        <w:rPr>
+          <w:rFonts w:ascii="Calibri" w:cs="Calibri" w:eastAsia="Calibri" w:hAnsi="Calibri"/>
+          <w:b w:val="false"/>
+          <w:bCs w:val="false"/>
+          <w:color w:val="2E3A36"/>
+          <w:sz w:val="22"/>
+          <w:szCs w:val="22"/>
+        </w:rPr>
+        <w:t xml:space="preserve">No se puede mandar el acceso directo por mail: apunta a rutas de tu propia computadora. Cada uno crea el suyo (son 10 segundos con los pasos de arriba).</w:t>
+      </w:r>
+    </w:p>
+    <w:p>
+      <w:pPr>
+        <w:pStyle w:val="ListParagraph"/>
+        <w:numPr>
+          <w:ilvl w:val="0"/>
+          <w:numId w:val="2"/>
+        </w:numPr>
+        <w:spacing w:after="120" w:line="300"/>
+      </w:pPr>
+      <w:r>
+        <w:rPr>
+          <w:rFonts w:ascii="Calibri" w:cs="Calibri" w:eastAsia="Calibri" w:hAnsi="Calibri"/>
+          <w:b w:val="false"/>
+          <w:bCs w:val="false"/>
+          <w:color w:val="2E3A36"/>
+          <w:sz w:val="22"/>
+          <w:szCs w:val="22"/>
+        </w:rPr>
+        <w:t xml:space="preserve">Si alguien quedó usando una copia vieja de la app, al abrirla verá el aviso “Estás usando una versión vieja de la app”: en ese caso, volver a entrar por el acceso directo.</w:t>
+      </w:r>
+    </w:p>
+    <w:p>
+      <w:pPr>
+        <w:pStyle w:val="ListParagraph"/>
+        <w:numPr>
+          <w:ilvl w:val="0"/>
+          <w:numId w:val="2"/>
+        </w:numPr>
+        <w:spacing w:after="120" w:line="300"/>
+      </w:pPr>
+      <w:r>
+        <w:rPr>
+          <w:rFonts w:ascii="Calibri" w:cs="Calibri" w:eastAsia="Calibri" w:hAnsi="Calibri"/>
+          <w:b w:val="false"/>
+          <w:bCs w:val="false"/>
+          <w:color w:val="2E3A36"/>
+          <w:sz w:val="22"/>
+          <w:szCs w:val="22"/>
+        </w:rPr>
+        <w:t xml:space="preserve">Si por error se borra un archivo de la carpeta compartida, no entres en pánico: OneDrive/SharePoint tiene papelera de reciclaje y se recupera desde ahí.</w:t>
+      </w:r>
+    </w:p>
+    <w:p>
+      <w:pPr>
+        <w:pStyle w:val="Heading1"/>
+        <w:spacing w:after="160" w:before="320"/>
+      </w:pPr>
+      <w:r>
+        <w:rPr>
+          <w:rFonts w:ascii="Calibri" w:cs="Calibri" w:eastAsia="Calibri" w:hAnsi="Calibri"/>
+          <w:b/>
+          <w:bCs/>
+          <w:color w:val="1E5C70"/>
+          <w:sz w:val="30"/>
+          <w:szCs w:val="30"/>
+        </w:rPr>
+        <w:t xml:space="preserve">8. Si algo no se ve como esperabas</w:t>
       </w:r>
     </w:p>
     <w:tbl>

</xml_diff>

<commit_message>
Guía de uso v2: filtros de Responsable/Sponsor, exportación a Excel y capturas del diseño compacto
Co-Authored-By: Claude Fable 5 <noreply@anthropic.com>
Claude-Session: https://claude.ai/code/session_0166RiLn2rUwdXUeF7kGLw2U
</commit_message>
<xml_diff>
--- a/Guia-de-uso-Tracking-Iniciativas.docx
+++ b/Guia-de-uso-Tracking-Iniciativas.docx
@@ -81,7 +81,7 @@
           <w:sz w:val="22"/>
           <w:szCs w:val="22"/>
         </w:rPr>
-        <w:t xml:space="preserve">Es la Torre de Control donde el equipo sigue las iniciativas estratégicas: cada uno puede crear iniciativas, editarlas y cambiar su estado. Todos trabajan sobre una misma base de datos (un archivo JSON en la carpeta compartida del equipo), así que los cambios de cada persona los ven los demás.</w:t>
+        <w:t xml:space="preserve">Es la Herramienta donde el equipo sigue las iniciativas estratégicas: cada uno puede crear iniciativas, editarlas y cambiar su estado. Todos trabajan sobre una misma base de datos (un archivo JSON en la carpeta compartida del equipo), así que los cambios de cada persona los ven los demás.</w:t>
       </w:r>
     </w:p>
     <w:p>
@@ -366,7 +366,7 @@
       <w:r>
         <w:drawing>
           <wp:inline distT="0" distB="0" distL="0" distR="0">
-            <wp:extent cx="5905500" cy="1047750"/>
+            <wp:extent cx="5905500" cy="942975"/>
             <wp:effectExtent t="0" r="0" b="0" l="0"/>
             <wp:docPr id="1" name="" descr="" title=""/>
             <wp:cNvGraphicFramePr>
@@ -391,7 +391,7 @@
                   <pic:spPr bwMode="auto">
                     <a:xfrm>
                       <a:off x="0" y="0"/>
-                      <a:ext cx="5905500" cy="1047750"/>
+                      <a:ext cx="5905500" cy="942975"/>
                     </a:xfrm>
                     <a:prstGeom prst="rect">
                       <a:avLst/>
@@ -629,7 +629,7 @@
       <w:r>
         <w:drawing>
           <wp:inline distT="0" distB="0" distL="0" distR="0">
-            <wp:extent cx="5905500" cy="1047750"/>
+            <wp:extent cx="5905500" cy="942975"/>
             <wp:effectExtent t="0" r="0" b="0" l="0"/>
             <wp:docPr id="1" name="" descr="" title=""/>
             <wp:cNvGraphicFramePr>
@@ -654,7 +654,7 @@
                   <pic:spPr bwMode="auto">
                     <a:xfrm>
                       <a:off x="0" y="0"/>
-                      <a:ext cx="5905500" cy="1047750"/>
+                      <a:ext cx="5905500" cy="942975"/>
                     </a:xfrm>
                     <a:prstGeom prst="rect">
                       <a:avLst/>
@@ -766,7 +766,7 @@
       <w:r>
         <w:drawing>
           <wp:inline distT="0" distB="0" distL="0" distR="0">
-            <wp:extent cx="5905500" cy="1047750"/>
+            <wp:extent cx="5905500" cy="942975"/>
             <wp:effectExtent t="0" r="0" b="0" l="0"/>
             <wp:docPr id="1" name="" descr="" title=""/>
             <wp:cNvGraphicFramePr>
@@ -791,7 +791,7 @@
                   <pic:spPr bwMode="auto">
                     <a:xfrm>
                       <a:off x="0" y="0"/>
-                      <a:ext cx="5905500" cy="1047750"/>
+                      <a:ext cx="5905500" cy="942975"/>
                     </a:xfrm>
                     <a:prstGeom prst="rect">
                       <a:avLst/>
@@ -1100,6 +1100,136 @@
           <w:szCs w:val="22"/>
         </w:rPr>
         <w:t xml:space="preserve">al escribir en el buscador aparece una lista de sugerencias (iniciativas, responsables, pilares, etiquetas…): hacé clic en una para filtrar. El filtro aplica a todas las vistas.</w:t>
+      </w:r>
+    </w:p>
+    <w:p>
+      <w:pPr>
+        <w:pStyle w:val="ListParagraph"/>
+        <w:numPr>
+          <w:ilvl w:val="0"/>
+          <w:numId w:val="2"/>
+        </w:numPr>
+        <w:spacing w:after="120" w:line="300"/>
+      </w:pPr>
+      <w:r>
+        <w:rPr>
+          <w:rFonts w:ascii="Calibri" w:cs="Calibri" w:eastAsia="Calibri" w:hAnsi="Calibri"/>
+          <w:b/>
+          <w:bCs/>
+          <w:color w:val="2E3A36"/>
+          <w:sz w:val="22"/>
+          <w:szCs w:val="22"/>
+        </w:rPr>
+        <w:t xml:space="preserve">Filtrar por persona: </w:t>
+      </w:r>
+      <w:r>
+        <w:rPr>
+          <w:rFonts w:ascii="Calibri" w:cs="Calibri" w:eastAsia="Calibri" w:hAnsi="Calibri"/>
+          <w:b w:val="false"/>
+          <w:bCs w:val="false"/>
+          <w:color w:val="2E3A36"/>
+          <w:sz w:val="22"/>
+          <w:szCs w:val="22"/>
+        </w:rPr>
+        <w:t xml:space="preserve">los desplegables </w:t>
+      </w:r>
+      <w:r>
+        <w:rPr>
+          <w:rFonts w:ascii="Calibri" w:cs="Calibri" w:eastAsia="Calibri" w:hAnsi="Calibri"/>
+          <w:b/>
+          <w:bCs/>
+          <w:color w:val="2E3A36"/>
+          <w:sz w:val="22"/>
+          <w:szCs w:val="22"/>
+        </w:rPr>
+        <w:t xml:space="preserve">Responsable</w:t>
+      </w:r>
+      <w:r>
+        <w:rPr>
+          <w:rFonts w:ascii="Calibri" w:cs="Calibri" w:eastAsia="Calibri" w:hAnsi="Calibri"/>
+          <w:b w:val="false"/>
+          <w:bCs w:val="false"/>
+          <w:color w:val="2E3A36"/>
+          <w:sz w:val="22"/>
+          <w:szCs w:val="22"/>
+        </w:rPr>
+        <w:t xml:space="preserve"> y </w:t>
+      </w:r>
+      <w:r>
+        <w:rPr>
+          <w:rFonts w:ascii="Calibri" w:cs="Calibri" w:eastAsia="Calibri" w:hAnsi="Calibri"/>
+          <w:b/>
+          <w:bCs/>
+          <w:color w:val="2E3A36"/>
+          <w:sz w:val="22"/>
+          <w:szCs w:val="22"/>
+        </w:rPr>
+        <w:t xml:space="preserve">Sponsor</w:t>
+      </w:r>
+      <w:r>
+        <w:rPr>
+          <w:rFonts w:ascii="Calibri" w:cs="Calibri" w:eastAsia="Calibri" w:hAnsi="Calibri"/>
+          <w:b w:val="false"/>
+          <w:bCs w:val="false"/>
+          <w:color w:val="2E3A36"/>
+          <w:sz w:val="22"/>
+          <w:szCs w:val="22"/>
+        </w:rPr>
+        <w:t xml:space="preserve"> muestran el listado de personas; al elegir una ves sus iniciativas (como responsable o como sponsor). El listado se actualiza solo cuando se crean iniciativas con nombres nuevos.</w:t>
+      </w:r>
+    </w:p>
+    <w:p>
+      <w:pPr>
+        <w:pStyle w:val="ListParagraph"/>
+        <w:numPr>
+          <w:ilvl w:val="0"/>
+          <w:numId w:val="2"/>
+        </w:numPr>
+        <w:spacing w:after="120" w:line="300"/>
+      </w:pPr>
+      <w:r>
+        <w:rPr>
+          <w:rFonts w:ascii="Calibri" w:cs="Calibri" w:eastAsia="Calibri" w:hAnsi="Calibri"/>
+          <w:b/>
+          <w:bCs/>
+          <w:color w:val="2E3A36"/>
+          <w:sz w:val="22"/>
+          <w:szCs w:val="22"/>
+        </w:rPr>
+        <w:t xml:space="preserve">Exportar a Excel: </w:t>
+      </w:r>
+      <w:r>
+        <w:rPr>
+          <w:rFonts w:ascii="Calibri" w:cs="Calibri" w:eastAsia="Calibri" w:hAnsi="Calibri"/>
+          <w:b w:val="false"/>
+          <w:bCs w:val="false"/>
+          <w:color w:val="2E3A36"/>
+          <w:sz w:val="22"/>
+          <w:szCs w:val="22"/>
+        </w:rPr>
+        <w:t xml:space="preserve">en </w:t>
+      </w:r>
+      <w:r>
+        <w:rPr>
+          <w:rFonts w:ascii="Calibri" w:cs="Calibri" w:eastAsia="Calibri" w:hAnsi="Calibri"/>
+          <w:b/>
+          <w:bCs/>
+          <w:color w:val="2E3A36"/>
+          <w:sz w:val="22"/>
+          <w:szCs w:val="22"/>
+        </w:rPr>
+        <w:t xml:space="preserve">Compartir → Exportar → Descargar Excel (.xlsx)</w:t>
+      </w:r>
+      <w:r>
+        <w:rPr>
+          <w:rFonts w:ascii="Calibri" w:cs="Calibri" w:eastAsia="Calibri" w:hAnsi="Calibri"/>
+          <w:b w:val="false"/>
+          <w:bCs w:val="false"/>
+          <w:color w:val="2E3A36"/>
+          <w:sz w:val="22"/>
+          <w:szCs w:val="22"/>
+        </w:rPr>
+        <w:t xml:space="preserve"> obtenés una planilla con una fila por iniciativa (26 columnas, incluidos días restantes y situación del semáforo), lista para análisis o presentaciones.</w:t>
       </w:r>
     </w:p>
     <w:p>
@@ -2025,18 +2155,18 @@
           <w:sz w:val="22"/>
           <w:szCs w:val="22"/>
         </w:rPr>
-        <w:t xml:space="preserve">Compartir → Exportar → Descargar archivo</w:t>
-      </w:r>
-      <w:r>
-        <w:rPr>
-          <w:rFonts w:ascii="Calibri" w:cs="Calibri" w:eastAsia="Calibri" w:hAnsi="Calibri"/>
-          <w:b w:val="false"/>
-          <w:bCs w:val="false"/>
-          <w:color w:val="2E3A36"/>
-          <w:sz w:val="22"/>
-          <w:szCs w:val="22"/>
-        </w:rPr>
-        <w:t xml:space="preserve">.</w:t>
+        <w:t xml:space="preserve">Compartir → Exportar → Descargar JSON (respaldo)</w:t>
+      </w:r>
+      <w:r>
+        <w:rPr>
+          <w:rFonts w:ascii="Calibri" w:cs="Calibri" w:eastAsia="Calibri" w:hAnsi="Calibri"/>
+          <w:b w:val="false"/>
+          <w:bCs w:val="false"/>
+          <w:color w:val="2E3A36"/>
+          <w:sz w:val="22"/>
+          <w:szCs w:val="22"/>
+        </w:rPr>
+        <w:t xml:space="preserve">. El Excel es para análisis; el JSON es el formato que sirve para restaurar.</w:t>
       </w:r>
     </w:p>
     <w:p>
@@ -2096,7 +2226,7 @@
           <w:sz w:val="18"/>
           <w:szCs w:val="18"/>
         </w:rPr>
-        <w:t xml:space="preserve">Tracking de Iniciativas S&amp;OP · Megalabs — guía para usuarios · v1</w:t>
+        <w:t xml:space="preserve">Tracking de Iniciativas S&amp;OP · Megalabs — guía para usuarios · v2</w:t>
       </w:r>
     </w:p>
     <w:sectPr>

</xml_diff>